<commit_message>
TTAB answer, notice of opposition and trial brief docx: docx/reference.xml on base="xengine" (the make-reference.sh arguments); the trial brief's table-of-authorities passes (render.sh, toa-pages.sh) move onto fb render's needles (a needle per toa: link in document order, B or N, and the body's start as the arabic section) and its last section to FORMBOOK_FINAL; scripts and reference.docx deleted, baseline entries removed; every .docx.pdf byte-identical, check.sh typst and docx 0 failed, XENG-001..003 pass (fb-595.68.3)
</commit_message>
<xml_diff>
--- a/courts/federal-circuit/trademark-trial-and-appeal-board/trial-brief/usage/OUTPUT-trial-brief.docx
+++ b/courts/federal-circuit/trademark-trial-and-appeal-board/trial-brief/usage/OUTPUT-trial-brief.docx
@@ -696,7 +696,7 @@
         <w:spacing w:before="0" w:after="0" w:line="20" w:lineRule="exact"/>
         <w:ind w:left="0" w:firstLine="0"/>
         <w:sectPr>
-          <w:footerReference w:type="default" r:id="rIdFooter1"/>
+          <w:footerReference w:type="default" r:id="rIdFtrPage"/>
           <w:pgSz w:w="12240" w:h="15840"/>
           <w:pgMar w:top="1440" w:right="1440" w:bottom="1440" w:left="1440" w:header="720" w:footer="432" w:gutter="0"/>
           <w:pgNumType w:fmt="lowerRoman"/>
@@ -5179,7 +5179,7 @@
       </w:r>
     </w:p>
     <w:sectPr>
-      <w:footerReference w:type="default" r:id="rIdFooter1"/>
+      <w:footerReference w:type="default" r:id="rIdFtrPage"/>
       <w:pgSz w:w="12240" w:h="15840"/>
       <w:pgMar w:top="1440" w:right="1440" w:bottom="1440" w:left="1440" w:header="720" w:footer="432" w:gutter="0"/>
       <w:pgNumType w:fmt="decimal" w:start="1"/>
@@ -5253,6 +5253,72 @@
     </w:p>
   </w:footnote>
 </w:footnotes>
+</file>
+
+<file path=word/ftr-add.xml><?xml version="1.0" encoding="utf-8"?>
+<w:ftr xmlns:w="http://schemas.openxmlformats.org/wordprocessingml/2006/main" xmlns:r="http://schemas.openxmlformats.org/officeDocument/2006/relationships">
+  <w:p>
+    <w:pPr>
+      <w:spacing w:before="0" w:after="0"/>
+      <w:jc w:val="center"/>
+    </w:pPr>
+    <w:r>
+      <w:t>Add-</w:t>
+    </w:r>
+    <w:r>
+      <w:fldChar w:fldCharType="begin"/>
+    </w:r>
+    <w:r>
+      <w:instrText xml:space="preserve"> PAGE </w:instrText>
+    </w:r>
+    <w:r>
+      <w:fldChar w:fldCharType="separate"/>
+    </w:r>
+    <w:r>
+      <w:t>1</w:t>
+    </w:r>
+    <w:r>
+      <w:fldChar w:fldCharType="end"/>
+    </w:r>
+  </w:p>
+</w:ftr>
+</file>
+
+<file path=word/ftr-none.xml><?xml version="1.0" encoding="utf-8"?>
+<w:ftr xmlns:w="http://schemas.openxmlformats.org/wordprocessingml/2006/main" xmlns:r="http://schemas.openxmlformats.org/officeDocument/2006/relationships">
+  <w:p>
+    <w:pPr>
+      <w:spacing w:before="0" w:after="0"/>
+      <w:jc w:val="center"/>
+    </w:pPr>
+  </w:p>
+</w:ftr>
+</file>
+
+<file path=word/ftr-page.xml><?xml version="1.0" encoding="utf-8"?>
+<w:ftr xmlns:w="http://schemas.openxmlformats.org/wordprocessingml/2006/main" xmlns:r="http://schemas.openxmlformats.org/officeDocument/2006/relationships">
+  <w:p>
+    <w:pPr>
+      <w:spacing w:before="0" w:after="0"/>
+      <w:jc w:val="center"/>
+    </w:pPr>
+    <w:r>
+      <w:fldChar w:fldCharType="begin"/>
+    </w:r>
+    <w:r>
+      <w:instrText xml:space="preserve"> PAGE </w:instrText>
+    </w:r>
+    <w:r>
+      <w:fldChar w:fldCharType="separate"/>
+    </w:r>
+    <w:r>
+      <w:t>1</w:t>
+    </w:r>
+    <w:r>
+      <w:fldChar w:fldCharType="end"/>
+    </w:r>
+  </w:p>
+</w:ftr>
 </file>
 
 <file path=word/numbering.xml><?xml version="1.0" encoding="utf-8"?>

</xml_diff>